<commit_message>
Initial implementation of enhancement pages, add title pages to enhancement narratives, more slight wording changes
</commit_message>
<xml_diff>
--- a/projects/powerscale/enhancement-1/CS 499 Enhancement 1 Narrative Manny DaSilva.docx
+++ b/projects/powerscale/enhancement-1/CS 499 Enhancement 1 Narrative Manny DaSilva.docx
@@ -10,12 +10,6 @@
           <w:rFonts w:ascii="Times New Roman" w:hAnsi="Times New Roman" w:cs="Times New Roman"/>
         </w:rPr>
       </w:pPr>
-      <w:r>
-        <w:rPr>
-          <w:rFonts w:ascii="Times New Roman" w:hAnsi="Times New Roman" w:cs="Times New Roman"/>
-        </w:rPr>
-        <w:t>The artifact I chose for enhancement in Category One, Software Engineering and Design, is an Android application called PowerScale. PowerScale is a weight-tracking mobile application built in Android Studio using Java, XML, and SQLite. The application allows users to create an account, log in, record weight entries, set a goal weight, and track their progress over time. The original version of this application was developed during the CS 360 Mobile Architecture and Programming course.</w:t>
-      </w:r>
     </w:p>
     <w:p>
       <w:pPr>
@@ -25,11 +19,284 @@
           <w:rFonts w:ascii="Times New Roman" w:hAnsi="Times New Roman" w:cs="Times New Roman"/>
         </w:rPr>
       </w:pPr>
-      <w:r>
-        <w:rPr>
-          <w:rFonts w:ascii="Times New Roman" w:hAnsi="Times New Roman" w:cs="Times New Roman"/>
-        </w:rPr>
-        <w:t xml:space="preserve">I selected this artifact for my ePortfolio because it demonstrates several key skills related to software engineering, design, and mobile application development. The application includes user authentication, database persistence, user interface design, and input validation. These components </w:t>
+    </w:p>
+    <w:p>
+      <w:pPr>
+        <w:spacing w:line="480" w:lineRule="auto"/>
+        <w:ind w:firstLine="720"/>
+        <w:rPr>
+          <w:rFonts w:ascii="Times New Roman" w:hAnsi="Times New Roman" w:cs="Times New Roman"/>
+        </w:rPr>
+      </w:pPr>
+    </w:p>
+    <w:p>
+      <w:pPr>
+        <w:spacing w:line="480" w:lineRule="auto"/>
+        <w:ind w:firstLine="720"/>
+        <w:rPr>
+          <w:rFonts w:ascii="Times New Roman" w:hAnsi="Times New Roman" w:cs="Times New Roman"/>
+        </w:rPr>
+      </w:pPr>
+    </w:p>
+    <w:p>
+      <w:pPr>
+        <w:spacing w:line="480" w:lineRule="auto"/>
+        <w:ind w:firstLine="720"/>
+        <w:rPr>
+          <w:rFonts w:ascii="Times New Roman" w:hAnsi="Times New Roman" w:cs="Times New Roman"/>
+        </w:rPr>
+      </w:pPr>
+    </w:p>
+    <w:p>
+      <w:pPr>
+        <w:spacing w:line="480" w:lineRule="auto"/>
+        <w:ind w:firstLine="720"/>
+        <w:rPr>
+          <w:rFonts w:ascii="Times New Roman" w:hAnsi="Times New Roman" w:cs="Times New Roman"/>
+        </w:rPr>
+      </w:pPr>
+    </w:p>
+    <w:p>
+      <w:pPr>
+        <w:spacing w:line="480" w:lineRule="auto"/>
+        <w:ind w:firstLine="720"/>
+        <w:jc w:val="center"/>
+        <w:rPr>
+          <w:rFonts w:ascii="Times New Roman" w:hAnsi="Times New Roman" w:cs="Times New Roman"/>
+        </w:rPr>
+      </w:pPr>
+      <w:r>
+        <w:rPr>
+          <w:rFonts w:ascii="Times New Roman" w:hAnsi="Times New Roman" w:cs="Times New Roman"/>
+        </w:rPr>
+        <w:t>Manny DaSilva</w:t>
+      </w:r>
+    </w:p>
+    <w:p>
+      <w:pPr>
+        <w:spacing w:line="480" w:lineRule="auto"/>
+        <w:ind w:firstLine="720"/>
+        <w:jc w:val="center"/>
+        <w:rPr>
+          <w:rFonts w:ascii="Times New Roman" w:hAnsi="Times New Roman" w:cs="Times New Roman"/>
+        </w:rPr>
+      </w:pPr>
+      <w:r>
+        <w:rPr>
+          <w:rFonts w:ascii="Times New Roman" w:hAnsi="Times New Roman" w:cs="Times New Roman"/>
+        </w:rPr>
+        <w:t>CS 499 Computer Science Capstone</w:t>
+      </w:r>
+    </w:p>
+    <w:p>
+      <w:pPr>
+        <w:spacing w:line="480" w:lineRule="auto"/>
+        <w:ind w:firstLine="720"/>
+        <w:jc w:val="center"/>
+        <w:rPr>
+          <w:rFonts w:ascii="Times New Roman" w:hAnsi="Times New Roman" w:cs="Times New Roman"/>
+        </w:rPr>
+      </w:pPr>
+      <w:r>
+        <w:rPr>
+          <w:rFonts w:ascii="Times New Roman" w:hAnsi="Times New Roman" w:cs="Times New Roman"/>
+        </w:rPr>
+        <w:t>Enhancement 1: Software Engineering and Design</w:t>
+      </w:r>
+    </w:p>
+    <w:p>
+      <w:pPr>
+        <w:spacing w:line="480" w:lineRule="auto"/>
+        <w:ind w:firstLine="720"/>
+        <w:jc w:val="center"/>
+        <w:rPr>
+          <w:rFonts w:ascii="Times New Roman" w:hAnsi="Times New Roman" w:cs="Times New Roman"/>
+        </w:rPr>
+      </w:pPr>
+      <w:proofErr w:type="spellStart"/>
+      <w:r>
+        <w:rPr>
+          <w:rFonts w:ascii="Times New Roman" w:hAnsi="Times New Roman" w:cs="Times New Roman"/>
+        </w:rPr>
+        <w:t>PowerScale</w:t>
+      </w:r>
+      <w:proofErr w:type="spellEnd"/>
+      <w:r>
+        <w:rPr>
+          <w:rFonts w:ascii="Times New Roman" w:hAnsi="Times New Roman" w:cs="Times New Roman"/>
+        </w:rPr>
+        <w:t xml:space="preserve"> Mobile Application</w:t>
+      </w:r>
+    </w:p>
+    <w:p>
+      <w:pPr>
+        <w:spacing w:line="480" w:lineRule="auto"/>
+        <w:ind w:firstLine="720"/>
+        <w:jc w:val="center"/>
+        <w:rPr>
+          <w:rFonts w:ascii="Times New Roman" w:hAnsi="Times New Roman" w:cs="Times New Roman"/>
+        </w:rPr>
+      </w:pPr>
+      <w:r>
+        <w:rPr>
+          <w:rFonts w:ascii="Times New Roman" w:hAnsi="Times New Roman" w:cs="Times New Roman"/>
+        </w:rPr>
+        <w:t>Southern New Hampshire University</w:t>
+      </w:r>
+    </w:p>
+    <w:p>
+      <w:pPr>
+        <w:spacing w:line="480" w:lineRule="auto"/>
+        <w:ind w:firstLine="720"/>
+        <w:jc w:val="center"/>
+        <w:rPr>
+          <w:rFonts w:ascii="Times New Roman" w:hAnsi="Times New Roman" w:cs="Times New Roman"/>
+        </w:rPr>
+      </w:pPr>
+      <w:r>
+        <w:rPr>
+          <w:rFonts w:ascii="Times New Roman" w:hAnsi="Times New Roman" w:cs="Times New Roman"/>
+        </w:rPr>
+        <w:t>April 2026</w:t>
+      </w:r>
+    </w:p>
+    <w:p>
+      <w:pPr>
+        <w:spacing w:line="480" w:lineRule="auto"/>
+        <w:ind w:firstLine="720"/>
+        <w:rPr>
+          <w:rFonts w:ascii="Times New Roman" w:hAnsi="Times New Roman" w:cs="Times New Roman"/>
+        </w:rPr>
+      </w:pPr>
+    </w:p>
+    <w:p>
+      <w:pPr>
+        <w:spacing w:line="480" w:lineRule="auto"/>
+        <w:ind w:firstLine="720"/>
+        <w:rPr>
+          <w:rFonts w:ascii="Times New Roman" w:hAnsi="Times New Roman" w:cs="Times New Roman"/>
+        </w:rPr>
+      </w:pPr>
+    </w:p>
+    <w:p>
+      <w:pPr>
+        <w:spacing w:line="480" w:lineRule="auto"/>
+        <w:ind w:firstLine="720"/>
+        <w:rPr>
+          <w:rFonts w:ascii="Times New Roman" w:hAnsi="Times New Roman" w:cs="Times New Roman"/>
+        </w:rPr>
+      </w:pPr>
+    </w:p>
+    <w:p>
+      <w:pPr>
+        <w:spacing w:line="480" w:lineRule="auto"/>
+        <w:ind w:firstLine="720"/>
+        <w:rPr>
+          <w:rFonts w:ascii="Times New Roman" w:hAnsi="Times New Roman" w:cs="Times New Roman"/>
+        </w:rPr>
+      </w:pPr>
+    </w:p>
+    <w:p>
+      <w:pPr>
+        <w:spacing w:line="480" w:lineRule="auto"/>
+        <w:rPr>
+          <w:rFonts w:ascii="Times New Roman" w:hAnsi="Times New Roman" w:cs="Times New Roman"/>
+        </w:rPr>
+      </w:pPr>
+    </w:p>
+    <w:p>
+      <w:pPr>
+        <w:spacing w:line="480" w:lineRule="auto"/>
+        <w:rPr>
+          <w:rFonts w:ascii="Times New Roman" w:hAnsi="Times New Roman" w:cs="Times New Roman"/>
+        </w:rPr>
+      </w:pPr>
+    </w:p>
+    <w:p>
+      <w:pPr>
+        <w:spacing w:line="480" w:lineRule="auto"/>
+        <w:ind w:firstLine="720"/>
+        <w:rPr>
+          <w:rFonts w:ascii="Times New Roman" w:hAnsi="Times New Roman" w:cs="Times New Roman"/>
+        </w:rPr>
+      </w:pPr>
+      <w:r>
+        <w:rPr>
+          <w:rFonts w:ascii="Times New Roman" w:hAnsi="Times New Roman" w:cs="Times New Roman"/>
+        </w:rPr>
+        <w:lastRenderedPageBreak/>
+        <w:t xml:space="preserve">The artifact I chose for enhancement in Category One, Software Engineering and Design, is an Android application called </w:t>
+      </w:r>
+      <w:proofErr w:type="spellStart"/>
+      <w:r>
+        <w:rPr>
+          <w:rFonts w:ascii="Times New Roman" w:hAnsi="Times New Roman" w:cs="Times New Roman"/>
+        </w:rPr>
+        <w:t>PowerScale</w:t>
+      </w:r>
+      <w:proofErr w:type="spellEnd"/>
+      <w:r>
+        <w:rPr>
+          <w:rFonts w:ascii="Times New Roman" w:hAnsi="Times New Roman" w:cs="Times New Roman"/>
+        </w:rPr>
+        <w:t xml:space="preserve">. </w:t>
+      </w:r>
+      <w:proofErr w:type="spellStart"/>
+      <w:r>
+        <w:rPr>
+          <w:rFonts w:ascii="Times New Roman" w:hAnsi="Times New Roman" w:cs="Times New Roman"/>
+        </w:rPr>
+        <w:t>PowerScale</w:t>
+      </w:r>
+      <w:proofErr w:type="spellEnd"/>
+      <w:r>
+        <w:rPr>
+          <w:rFonts w:ascii="Times New Roman" w:hAnsi="Times New Roman" w:cs="Times New Roman"/>
+        </w:rPr>
+        <w:t xml:space="preserve"> is a weight-tracking mobile application built in Android Studio using Java, XML, and SQLite. The application allows users to create an account, log in, record weight entries, set </w:t>
+      </w:r>
+      <w:proofErr w:type="gramStart"/>
+      <w:r>
+        <w:rPr>
+          <w:rFonts w:ascii="Times New Roman" w:hAnsi="Times New Roman" w:cs="Times New Roman"/>
+        </w:rPr>
+        <w:t>a goal</w:t>
+      </w:r>
+      <w:proofErr w:type="gramEnd"/>
+      <w:r>
+        <w:rPr>
+          <w:rFonts w:ascii="Times New Roman" w:hAnsi="Times New Roman" w:cs="Times New Roman"/>
+        </w:rPr>
+        <w:t xml:space="preserve"> weight, and track their progress over time. The original version of this application was developed during the CS 360 Mobile Architecture and Programming course.</w:t>
+      </w:r>
+    </w:p>
+    <w:p>
+      <w:pPr>
+        <w:spacing w:line="480" w:lineRule="auto"/>
+        <w:ind w:firstLine="720"/>
+        <w:rPr>
+          <w:rFonts w:ascii="Times New Roman" w:hAnsi="Times New Roman" w:cs="Times New Roman"/>
+        </w:rPr>
+      </w:pPr>
+      <w:r>
+        <w:rPr>
+          <w:rFonts w:ascii="Times New Roman" w:hAnsi="Times New Roman" w:cs="Times New Roman"/>
+        </w:rPr>
+        <w:t xml:space="preserve">I selected this artifact for my </w:t>
+      </w:r>
+      <w:proofErr w:type="spellStart"/>
+      <w:r>
+        <w:rPr>
+          <w:rFonts w:ascii="Times New Roman" w:hAnsi="Times New Roman" w:cs="Times New Roman"/>
+        </w:rPr>
+        <w:t>ePortfolio</w:t>
+      </w:r>
+      <w:proofErr w:type="spellEnd"/>
+      <w:r>
+        <w:rPr>
+          <w:rFonts w:ascii="Times New Roman" w:hAnsi="Times New Roman" w:cs="Times New Roman"/>
+        </w:rPr>
+        <w:t xml:space="preserve"> because it demonstrates several key skills related to software engineering, design, and mobile application development. The application includes user authentication, database persistence, user interface design, and input validation. These components </w:t>
       </w:r>
       <w:r>
         <w:rPr>
@@ -41,7 +308,35 @@
         <w:rPr>
           <w:rFonts w:ascii="Times New Roman" w:hAnsi="Times New Roman" w:cs="Times New Roman"/>
         </w:rPr>
-        <w:t xml:space="preserve"> my ability to build a full-stack mobile application that integrates front-end functionality with back-end data storage and business logic. For this enhancement, the application was refactored to follow the Model-View-ViewModel (MVVM) design pattern using ViewModel and Repository layers. This architectural change separated the user interface from the data and business logic, improving maintainability, scalability, and readability. Additionally, the project was improved with clearer documentation</w:t>
+        <w:t xml:space="preserve"> my ability to build a full-stack mobile application that integrates front-end functionality with back-end data storage and business logic. For this enhancement, the application was refactored to follow the Model-View-</w:t>
+      </w:r>
+      <w:proofErr w:type="spellStart"/>
+      <w:r>
+        <w:rPr>
+          <w:rFonts w:ascii="Times New Roman" w:hAnsi="Times New Roman" w:cs="Times New Roman"/>
+        </w:rPr>
+        <w:t>ViewModel</w:t>
+      </w:r>
+      <w:proofErr w:type="spellEnd"/>
+      <w:r>
+        <w:rPr>
+          <w:rFonts w:ascii="Times New Roman" w:hAnsi="Times New Roman" w:cs="Times New Roman"/>
+        </w:rPr>
+        <w:t xml:space="preserve"> (MVVM) design pattern using </w:t>
+      </w:r>
+      <w:proofErr w:type="spellStart"/>
+      <w:r>
+        <w:rPr>
+          <w:rFonts w:ascii="Times New Roman" w:hAnsi="Times New Roman" w:cs="Times New Roman"/>
+        </w:rPr>
+        <w:t>ViewModel</w:t>
+      </w:r>
+      <w:proofErr w:type="spellEnd"/>
+      <w:r>
+        <w:rPr>
+          <w:rFonts w:ascii="Times New Roman" w:hAnsi="Times New Roman" w:cs="Times New Roman"/>
+        </w:rPr>
+        <w:t xml:space="preserve"> and Repository layers. This architectural change separated the user interface from the data and business logic, improving maintainability, scalability, and readability. Additionally, the project was improved with clearer documentation</w:t>
       </w:r>
       <w:r>
         <w:rPr>
@@ -98,14 +393,70 @@
         <w:rPr>
           <w:rFonts w:ascii="Times New Roman" w:hAnsi="Times New Roman" w:cs="Times New Roman"/>
         </w:rPr>
-        <w:t xml:space="preserve">This enhancement met the course outcomes that were identified in Module One, particularly in the area of software engineering and design. The refactored application demonstrates a separation of concerns and responsibilities by moving data access and business logic out of the Activity classes and into ViewModel and Repository layers. This structure aligns with professional and up-to-date Android development practices and demonstrates my ability to redesign an existing codebase into a more maintainable and scalable architecture. At this time, </w:t>
+        <w:t xml:space="preserve">This enhancement met the course outcomes that were identified in Module One, particularly in the area of software engineering and design. The refactored application demonstrates a separation of concerns and responsibilities by moving data access and business logic out of the Activity classes and into </w:t>
+      </w:r>
+      <w:proofErr w:type="spellStart"/>
+      <w:r>
+        <w:rPr>
+          <w:rFonts w:ascii="Times New Roman" w:hAnsi="Times New Roman" w:cs="Times New Roman"/>
+        </w:rPr>
+        <w:t>ViewModel</w:t>
+      </w:r>
+      <w:proofErr w:type="spellEnd"/>
+      <w:r>
+        <w:rPr>
+          <w:rFonts w:ascii="Times New Roman" w:hAnsi="Times New Roman" w:cs="Times New Roman"/>
+        </w:rPr>
+        <w:t xml:space="preserve"> and Repository layers. This structure aligns with professional and up-to-date Android development practices and demonstrates my ability to redesign an existing codebase into </w:t>
+      </w:r>
+      <w:proofErr w:type="gramStart"/>
+      <w:r>
+        <w:rPr>
+          <w:rFonts w:ascii="Times New Roman" w:hAnsi="Times New Roman" w:cs="Times New Roman"/>
+        </w:rPr>
+        <w:t>a more</w:t>
+      </w:r>
+      <w:proofErr w:type="gramEnd"/>
+      <w:r>
+        <w:rPr>
+          <w:rFonts w:ascii="Times New Roman" w:hAnsi="Times New Roman" w:cs="Times New Roman"/>
+        </w:rPr>
+        <w:t xml:space="preserve"> maintainable and scalable architecture. At this time, </w:t>
       </w:r>
       <w:r>
         <w:rPr>
           <w:rFonts w:ascii="Times New Roman" w:hAnsi="Times New Roman" w:cs="Times New Roman"/>
         </w:rPr>
         <w:lastRenderedPageBreak/>
-        <w:t xml:space="preserve">my outcome coverage plan has changed just slightly. The first small change is that AppDatabaseHelper will now serve as the DAO, which I made note of in the class comment. This is because AppDatabaseHelper is already responsible for executing all SQL operations, including creating tables, inserting, updating, deleting, and querying data. Since it already </w:t>
+        <w:t xml:space="preserve">my outcome coverage plan has changed just slightly. The first small change is that </w:t>
+      </w:r>
+      <w:proofErr w:type="spellStart"/>
+      <w:r>
+        <w:rPr>
+          <w:rFonts w:ascii="Times New Roman" w:hAnsi="Times New Roman" w:cs="Times New Roman"/>
+        </w:rPr>
+        <w:t>AppDatabaseHelper</w:t>
+      </w:r>
+      <w:proofErr w:type="spellEnd"/>
+      <w:r>
+        <w:rPr>
+          <w:rFonts w:ascii="Times New Roman" w:hAnsi="Times New Roman" w:cs="Times New Roman"/>
+        </w:rPr>
+        <w:t xml:space="preserve"> will now serve as the DAO, which I made note of in the class comment. This is because </w:t>
+      </w:r>
+      <w:proofErr w:type="spellStart"/>
+      <w:r>
+        <w:rPr>
+          <w:rFonts w:ascii="Times New Roman" w:hAnsi="Times New Roman" w:cs="Times New Roman"/>
+        </w:rPr>
+        <w:t>AppDatabaseHelper</w:t>
+      </w:r>
+      <w:proofErr w:type="spellEnd"/>
+      <w:r>
+        <w:rPr>
+          <w:rFonts w:ascii="Times New Roman" w:hAnsi="Times New Roman" w:cs="Times New Roman"/>
+        </w:rPr>
+        <w:t xml:space="preserve"> is already responsible for executing all SQL operations, including creating tables, inserting, updating, deleting, and querying data. Since it already </w:t>
       </w:r>
       <w:r>
         <w:rPr>
@@ -586,7 +937,21 @@
         <w:rPr>
           <w:rFonts w:ascii="Times New Roman" w:hAnsi="Times New Roman" w:cs="Times New Roman"/>
         </w:rPr>
-        <w:t xml:space="preserve">related to how LiveData updates are observed asynchronously, </w:t>
+        <w:t xml:space="preserve">related to how </w:t>
+      </w:r>
+      <w:proofErr w:type="spellStart"/>
+      <w:r>
+        <w:rPr>
+          <w:rFonts w:ascii="Times New Roman" w:hAnsi="Times New Roman" w:cs="Times New Roman"/>
+        </w:rPr>
+        <w:t>LiveData</w:t>
+      </w:r>
+      <w:proofErr w:type="spellEnd"/>
+      <w:r>
+        <w:rPr>
+          <w:rFonts w:ascii="Times New Roman" w:hAnsi="Times New Roman" w:cs="Times New Roman"/>
+        </w:rPr>
+        <w:t xml:space="preserve"> updates are observed asynchronously, </w:t>
       </w:r>
       <w:r>
         <w:rPr>
@@ -634,7 +999,35 @@
         <w:rPr>
           <w:rFonts w:ascii="Times New Roman" w:hAnsi="Times New Roman" w:cs="Times New Roman"/>
         </w:rPr>
-        <w:t xml:space="preserve"> the data flow between the ViewModel and the UI and ensuring that goal evaluation logic was triggered only after the LiveData state </w:t>
+        <w:t xml:space="preserve"> the data flow between the </w:t>
+      </w:r>
+      <w:proofErr w:type="spellStart"/>
+      <w:r>
+        <w:rPr>
+          <w:rFonts w:ascii="Times New Roman" w:hAnsi="Times New Roman" w:cs="Times New Roman"/>
+        </w:rPr>
+        <w:t>ViewModel</w:t>
+      </w:r>
+      <w:proofErr w:type="spellEnd"/>
+      <w:r>
+        <w:rPr>
+          <w:rFonts w:ascii="Times New Roman" w:hAnsi="Times New Roman" w:cs="Times New Roman"/>
+        </w:rPr>
+        <w:t xml:space="preserve"> and the UI and ensuring that goal evaluation logic was triggered only after the </w:t>
+      </w:r>
+      <w:proofErr w:type="spellStart"/>
+      <w:r>
+        <w:rPr>
+          <w:rFonts w:ascii="Times New Roman" w:hAnsi="Times New Roman" w:cs="Times New Roman"/>
+        </w:rPr>
+        <w:t>LiveData</w:t>
+      </w:r>
+      <w:proofErr w:type="spellEnd"/>
+      <w:r>
+        <w:rPr>
+          <w:rFonts w:ascii="Times New Roman" w:hAnsi="Times New Roman" w:cs="Times New Roman"/>
+        </w:rPr>
+        <w:t xml:space="preserve"> state </w:t>
       </w:r>
       <w:r>
         <w:rPr>

</xml_diff>